<commit_message>
📄 DOCX firmado: EMT071218J20 - 18/3/2026, 10:15:51 p.m.
</commit_message>
<xml_diff>
--- a/data/declaraciones/signed/EMT071218J20.docx
+++ b/data/declaraciones/signed/EMT071218J20.docx
@@ -4184,7 +4184,7 @@
         <w:rPr>
           <w:lang w:val="es-MX"/>
         </w:rPr>
-        <w:t xml:space="preserve">ENTORNO DE MARKETING Y TECNOLOGIA SA DE CV</w:t>
+        <w:t xml:space="preserve">ENTORNO DE MARKETING Y TECNOLOGIA  SA DE CV</w:t>
       </w:r>
       <w:proofErr w:type="spellStart"/>
       <w:r>
@@ -4353,7 +4353,7 @@
         <w:rPr>
           <w:lang w:val="es-MX"/>
         </w:rPr>
-        <w:t xml:space="preserve">Fecha: 17 de marzo de 2026</w:t>
+        <w:t xml:space="preserve">Fecha: 18 de marzo de 2026</w:t>
       </w:r>
       <w:proofErr w:type="spellStart"/>
       <w:r>

</xml_diff>